<commit_message>
Integrate thread-pool, update README and htdocs
Makefile: link thpool.c so httpd is built with the thread-pool implementation. README: rewritten to document the refactor (SDS-based request handling, C thread pool, MIME/URL fixes), updated build/run notes and profiling results. Server: Tinyhttpd-master/httpd.c updated to match refactor. htdocs: many site updates and additions — switch font CDN to fonts.loli.net, add atom/rss alternates, lazy-load music iframes, set meting preload to none, adjust tag colors, and add a new 2026/03/29 post plus numerous static assets (fonts, images, arcade JSON, atom/rss2.xml, sbti images, rss/search files). Also updated search/tags/categories pages and other HTML tweaks. Two Documents (docx/pdf) binaries were replaced. Overall this commit synchronizes static site content with the refactored server and build changes.
</commit_message>
<xml_diff>
--- a/Documents/专业实践报告.docx
+++ b/Documents/专业实践报告.docx
@@ -495,6 +495,7 @@
         </w:rPr>
         <w:t xml:space="preserve"> / </w:t>
       </w:r>
+      <w:proofErr w:type="gramStart"/>
       <w:r>
         <w:rPr>
           <w:rFonts w:hint="eastAsia"/>
@@ -504,6 +505,7 @@
         </w:rPr>
         <w:t>许子轩</w:t>
       </w:r>
+      <w:proofErr w:type="gramEnd"/>
       <w:r>
         <w:rPr>
           <w:rFonts w:hint="eastAsia"/>
@@ -717,6 +719,7 @@
         </w:rPr>
         <w:t>在</w:t>
       </w:r>
+      <w:proofErr w:type="gramStart"/>
       <w:r>
         <w:rPr>
           <w:rFonts w:hint="eastAsia"/>
@@ -725,6 +728,8 @@
         </w:rPr>
         <w:t>整合原</w:t>
       </w:r>
+      <w:proofErr w:type="spellStart"/>
+      <w:proofErr w:type="gramEnd"/>
       <w:r>
         <w:rPr>
           <w:rFonts w:hint="eastAsia"/>
@@ -733,6 +738,7 @@
         </w:rPr>
         <w:t>Tinyhttpd</w:t>
       </w:r>
+      <w:proofErr w:type="spellEnd"/>
       <w:r>
         <w:rPr>
           <w:rFonts w:hint="eastAsia"/>
@@ -797,6 +803,7 @@
         </w:rPr>
         <w:t>原版只需要编译</w:t>
       </w:r>
+      <w:proofErr w:type="spellStart"/>
       <w:r>
         <w:rPr>
           <w:rFonts w:hint="eastAsia"/>
@@ -805,6 +812,7 @@
         </w:rPr>
         <w:t>httpd.c</w:t>
       </w:r>
+      <w:proofErr w:type="spellEnd"/>
       <w:r>
         <w:rPr>
           <w:rFonts w:hint="eastAsia"/>
@@ -877,6 +885,7 @@
         </w:rPr>
         <w:t>编写</w:t>
       </w:r>
+      <w:proofErr w:type="spellStart"/>
       <w:r>
         <w:rPr>
           <w:rFonts w:hint="eastAsia"/>
@@ -885,6 +894,7 @@
         </w:rPr>
         <w:t>Makefile</w:t>
       </w:r>
+      <w:proofErr w:type="spellEnd"/>
       <w:r>
         <w:rPr>
           <w:rFonts w:hint="eastAsia"/>
@@ -939,8 +949,18 @@
           <w:sz w:val="24"/>
           <w:szCs w:val="24"/>
         </w:rPr>
-        <w:t>-lpthread</w:t>
-      </w:r>
+        <w:t>-</w:t>
+      </w:r>
+      <w:proofErr w:type="spellStart"/>
+      <w:r>
+        <w:rPr>
+          <w:rFonts w:hint="eastAsia"/>
+          <w:sz w:val="24"/>
+          <w:szCs w:val="24"/>
+        </w:rPr>
+        <w:t>lpthread</w:t>
+      </w:r>
+      <w:proofErr w:type="spellEnd"/>
       <w:r>
         <w:rPr>
           <w:rFonts w:hint="eastAsia"/>
@@ -1013,6 +1033,7 @@
         </w:rPr>
         <w:t>在开发早期找到</w:t>
       </w:r>
+      <w:proofErr w:type="spellStart"/>
       <w:r>
         <w:rPr>
           <w:rFonts w:hint="eastAsia"/>
@@ -1021,6 +1042,7 @@
         </w:rPr>
         <w:t>simpleclient.c</w:t>
       </w:r>
+      <w:proofErr w:type="spellEnd"/>
       <w:r>
         <w:rPr>
           <w:rFonts w:hint="eastAsia"/>
@@ -1029,6 +1051,7 @@
         </w:rPr>
         <w:t>中未使用的</w:t>
       </w:r>
+      <w:proofErr w:type="spellStart"/>
       <w:r>
         <w:rPr>
           <w:rFonts w:hint="eastAsia"/>
@@ -1037,6 +1060,7 @@
         </w:rPr>
         <w:t>argc</w:t>
       </w:r>
+      <w:proofErr w:type="spellEnd"/>
       <w:r>
         <w:rPr>
           <w:sz w:val="24"/>
@@ -1059,6 +1083,7 @@
         </w:rPr>
         <w:t xml:space="preserve"> </w:t>
       </w:r>
+      <w:proofErr w:type="spellStart"/>
       <w:r>
         <w:rPr>
           <w:rFonts w:hint="eastAsia"/>
@@ -1067,6 +1092,7 @@
         </w:rPr>
         <w:t>argv</w:t>
       </w:r>
+      <w:proofErr w:type="spellEnd"/>
       <w:r>
         <w:rPr>
           <w:rFonts w:hint="eastAsia"/>
@@ -1283,8 +1309,17 @@
           <w:sz w:val="28"/>
           <w:szCs w:val="28"/>
         </w:rPr>
-        <w:t xml:space="preserve"> ThreadPool</w:t>
-      </w:r>
+        <w:t xml:space="preserve"> </w:t>
+      </w:r>
+      <w:proofErr w:type="spellStart"/>
+      <w:r>
+        <w:rPr>
+          <w:sz w:val="28"/>
+          <w:szCs w:val="28"/>
+        </w:rPr>
+        <w:t>ThreadPool</w:t>
+      </w:r>
+      <w:proofErr w:type="spellEnd"/>
     </w:p>
     <w:p>
       <w:pPr>
@@ -1643,6 +1678,7 @@
         </w:rPr>
         <w:t>获取连接之后，它会立刻调用</w:t>
       </w:r>
+      <w:proofErr w:type="spellStart"/>
       <w:r>
         <w:rPr>
           <w:rFonts w:hint="eastAsia"/>
@@ -1651,6 +1687,7 @@
         </w:rPr>
         <w:t>thpool_add_work</w:t>
       </w:r>
+      <w:proofErr w:type="spellEnd"/>
       <w:r>
         <w:rPr>
           <w:rFonts w:hint="eastAsia"/>
@@ -1736,6 +1773,7 @@
         </w:rPr>
         <w:t>线程完成任务抢占，执行</w:t>
       </w:r>
+      <w:proofErr w:type="spellStart"/>
       <w:r>
         <w:rPr>
           <w:rFonts w:hint="eastAsia"/>
@@ -1744,6 +1782,7 @@
         </w:rPr>
         <w:t>accept_request</w:t>
       </w:r>
+      <w:proofErr w:type="spellEnd"/>
       <w:r>
         <w:rPr>
           <w:rFonts w:hint="eastAsia"/>
@@ -1789,6 +1828,7 @@
         </w:rPr>
         <w:t>线程内部调用</w:t>
       </w:r>
+      <w:proofErr w:type="spellStart"/>
       <w:r>
         <w:rPr>
           <w:rFonts w:hint="eastAsia"/>
@@ -1797,6 +1837,7 @@
         </w:rPr>
         <w:t>get_line_sds</w:t>
       </w:r>
+      <w:proofErr w:type="spellEnd"/>
       <w:r>
         <w:rPr>
           <w:rFonts w:hint="eastAsia"/>
@@ -1805,6 +1846,7 @@
         </w:rPr>
         <w:t>完成数据读取，最终依照请求的具体类型，调用</w:t>
       </w:r>
+      <w:proofErr w:type="spellStart"/>
       <w:r>
         <w:rPr>
           <w:rFonts w:hint="eastAsia"/>
@@ -1813,6 +1855,7 @@
         </w:rPr>
         <w:t>execute_cgi</w:t>
       </w:r>
+      <w:proofErr w:type="spellEnd"/>
       <w:r>
         <w:rPr>
           <w:rFonts w:hint="eastAsia"/>
@@ -1821,6 +1864,7 @@
         </w:rPr>
         <w:t>或</w:t>
       </w:r>
+      <w:proofErr w:type="spellStart"/>
       <w:r>
         <w:rPr>
           <w:rFonts w:hint="eastAsia"/>
@@ -1829,6 +1873,7 @@
         </w:rPr>
         <w:t>serve_file</w:t>
       </w:r>
+      <w:proofErr w:type="spellEnd"/>
       <w:r>
         <w:rPr>
           <w:rFonts w:hint="eastAsia"/>
@@ -1951,6 +1996,7 @@
         </w:rPr>
         <w:t>SDS</w:t>
       </w:r>
+      <w:proofErr w:type="gramStart"/>
       <w:r>
         <w:rPr>
           <w:rFonts w:hint="eastAsia"/>
@@ -1964,7 +2010,15 @@
           <w:sz w:val="24"/>
           <w:szCs w:val="24"/>
         </w:rPr>
-        <w:t>可消除相关风险。</w:t>
+        <w:t>可消除</w:t>
+      </w:r>
+      <w:proofErr w:type="gramEnd"/>
+      <w:r>
+        <w:rPr>
+          <w:sz w:val="24"/>
+          <w:szCs w:val="24"/>
+        </w:rPr>
+        <w:t>相关风险。</w:t>
       </w:r>
     </w:p>
     <w:p>
@@ -2227,6 +2281,7 @@
         </w:rPr>
         <w:t>字段和</w:t>
       </w:r>
+      <w:proofErr w:type="spellStart"/>
       <w:r>
         <w:rPr>
           <w:sz w:val="24"/>
@@ -2234,6 +2289,7 @@
         </w:rPr>
         <w:t>buf</w:t>
       </w:r>
+      <w:proofErr w:type="spellEnd"/>
       <w:r>
         <w:rPr>
           <w:sz w:val="24"/>
@@ -2298,7 +2354,25 @@
           <w:sz w:val="24"/>
           <w:szCs w:val="24"/>
         </w:rPr>
-        <w:t xml:space="preserve"> alloc </w:t>
+        <w:t xml:space="preserve"> </w:t>
+      </w:r>
+      <w:proofErr w:type="spellStart"/>
+      <w:r>
+        <w:rPr>
+          <w:rFonts w:hint="eastAsia"/>
+          <w:sz w:val="24"/>
+          <w:szCs w:val="24"/>
+        </w:rPr>
+        <w:t>alloc</w:t>
+      </w:r>
+      <w:proofErr w:type="spellEnd"/>
+      <w:r>
+        <w:rPr>
+          <w:rFonts w:hint="eastAsia"/>
+          <w:sz w:val="24"/>
+          <w:szCs w:val="24"/>
+        </w:rPr>
+        <w:t xml:space="preserve"> </w:t>
       </w:r>
       <w:r>
         <w:rPr>
@@ -2308,13 +2382,23 @@
         </w:rPr>
         <w:t>记录物理内存总量，</w:t>
       </w:r>
-      <w:r>
-        <w:rPr>
-          <w:rFonts w:hint="eastAsia"/>
-          <w:sz w:val="24"/>
-          <w:szCs w:val="24"/>
-        </w:rPr>
-        <w:t xml:space="preserve">len </w:t>
+      <w:proofErr w:type="spellStart"/>
+      <w:r>
+        <w:rPr>
+          <w:rFonts w:hint="eastAsia"/>
+          <w:sz w:val="24"/>
+          <w:szCs w:val="24"/>
+        </w:rPr>
+        <w:t>len</w:t>
+      </w:r>
+      <w:proofErr w:type="spellEnd"/>
+      <w:r>
+        <w:rPr>
+          <w:rFonts w:hint="eastAsia"/>
+          <w:sz w:val="24"/>
+          <w:szCs w:val="24"/>
+        </w:rPr>
+        <w:t xml:space="preserve"> </w:t>
       </w:r>
       <w:r>
         <w:rPr>
@@ -2324,6 +2408,7 @@
         </w:rPr>
         <w:t>记录实际使用量，这种将元数据放置在结构前部的设计，让所有字符串追加操作，比如</w:t>
       </w:r>
+      <w:proofErr w:type="spellStart"/>
       <w:r>
         <w:rPr>
           <w:rFonts w:hint="eastAsia"/>
@@ -2332,6 +2417,7 @@
         </w:rPr>
         <w:t>sdscatlen</w:t>
       </w:r>
+      <w:proofErr w:type="spellEnd"/>
       <w:r>
         <w:rPr>
           <w:rFonts w:hint="eastAsia"/>
@@ -2469,7 +2555,25 @@
           <w:sz w:val="24"/>
           <w:szCs w:val="24"/>
         </w:rPr>
-        <w:t>char buf[1024]</w:t>
+        <w:t xml:space="preserve">char </w:t>
+      </w:r>
+      <w:proofErr w:type="spellStart"/>
+      <w:r>
+        <w:rPr>
+          <w:rFonts w:hint="eastAsia"/>
+          <w:sz w:val="24"/>
+          <w:szCs w:val="24"/>
+        </w:rPr>
+        <w:t>buf</w:t>
+      </w:r>
+      <w:proofErr w:type="spellEnd"/>
+      <w:r>
+        <w:rPr>
+          <w:rFonts w:hint="eastAsia"/>
+          <w:sz w:val="24"/>
+          <w:szCs w:val="24"/>
+        </w:rPr>
+        <w:t>[1024]</w:t>
       </w:r>
       <w:r>
         <w:rPr>
@@ -2485,7 +2589,25 @@
           <w:sz w:val="24"/>
           <w:szCs w:val="24"/>
         </w:rPr>
-        <w:t>接收请求头，栈溢出风险</w:t>
+        <w:t>接收请求头，</w:t>
+      </w:r>
+      <w:proofErr w:type="gramStart"/>
+      <w:r>
+        <w:rPr>
+          <w:rFonts w:hint="eastAsia"/>
+          <w:sz w:val="24"/>
+          <w:szCs w:val="24"/>
+        </w:rPr>
+        <w:t>栈</w:t>
+      </w:r>
+      <w:proofErr w:type="gramEnd"/>
+      <w:r>
+        <w:rPr>
+          <w:rFonts w:hint="eastAsia"/>
+          <w:sz w:val="24"/>
+          <w:szCs w:val="24"/>
+        </w:rPr>
+        <w:t>溢出风险</w:t>
       </w:r>
       <w:r>
         <w:rPr>
@@ -2527,6 +2649,7 @@
         </w:rPr>
         <w:t>了</w:t>
       </w:r>
+      <w:proofErr w:type="spellStart"/>
       <w:r>
         <w:rPr>
           <w:rFonts w:hint="eastAsia"/>
@@ -2535,6 +2658,7 @@
         </w:rPr>
         <w:t>get_line_sds</w:t>
       </w:r>
+      <w:proofErr w:type="spellEnd"/>
       <w:r>
         <w:rPr>
           <w:rFonts w:hint="eastAsia"/>
@@ -2543,13 +2667,23 @@
         </w:rPr>
         <w:t>函数，配合</w:t>
       </w:r>
-      <w:r>
-        <w:rPr>
-          <w:rFonts w:hint="eastAsia"/>
-          <w:sz w:val="24"/>
-          <w:szCs w:val="24"/>
-        </w:rPr>
-        <w:t>sdsclear(*line)</w:t>
+      <w:proofErr w:type="spellStart"/>
+      <w:r>
+        <w:rPr>
+          <w:rFonts w:hint="eastAsia"/>
+          <w:sz w:val="24"/>
+          <w:szCs w:val="24"/>
+        </w:rPr>
+        <w:t>sdsclear</w:t>
+      </w:r>
+      <w:proofErr w:type="spellEnd"/>
+      <w:r>
+        <w:rPr>
+          <w:rFonts w:hint="eastAsia"/>
+          <w:sz w:val="24"/>
+          <w:szCs w:val="24"/>
+        </w:rPr>
+        <w:t>(*line)</w:t>
       </w:r>
       <w:r>
         <w:rPr>
@@ -2559,6 +2693,7 @@
         </w:rPr>
         <w:t>完成内存复用，依托</w:t>
       </w:r>
+      <w:proofErr w:type="spellStart"/>
       <w:r>
         <w:rPr>
           <w:rFonts w:hint="eastAsia"/>
@@ -2567,6 +2702,7 @@
         </w:rPr>
         <w:t>sdscatlen</w:t>
       </w:r>
+      <w:proofErr w:type="spellEnd"/>
       <w:r>
         <w:rPr>
           <w:rFonts w:hint="eastAsia"/>
@@ -2641,6 +2777,7 @@
         </w:rPr>
         <w:t>线程池集成：消除</w:t>
       </w:r>
+      <w:proofErr w:type="spellStart"/>
       <w:r>
         <w:rPr>
           <w:sz w:val="28"/>
@@ -2648,6 +2785,7 @@
         </w:rPr>
         <w:t>Syscall</w:t>
       </w:r>
+      <w:proofErr w:type="spellEnd"/>
       <w:r>
         <w:rPr>
           <w:sz w:val="28"/>
@@ -2697,6 +2835,7 @@
         </w:rPr>
         <w:t>我们</w:t>
       </w:r>
+      <w:proofErr w:type="gramStart"/>
       <w:r>
         <w:rPr>
           <w:rFonts w:hint="eastAsia"/>
@@ -2713,6 +2852,7 @@
         </w:rPr>
         <w:t>了</w:t>
       </w:r>
+      <w:proofErr w:type="gramEnd"/>
       <w:r>
         <w:rPr>
           <w:rFonts w:hint="eastAsia"/>
@@ -2721,6 +2861,7 @@
         </w:rPr>
         <w:t>原版的</w:t>
       </w:r>
+      <w:proofErr w:type="spellStart"/>
       <w:r>
         <w:rPr>
           <w:rFonts w:hint="eastAsia"/>
@@ -2729,6 +2870,7 @@
         </w:rPr>
         <w:t>pthread_create</w:t>
       </w:r>
+      <w:proofErr w:type="spellEnd"/>
       <w:r>
         <w:rPr>
           <w:rFonts w:hint="eastAsia"/>
@@ -2737,13 +2879,23 @@
         </w:rPr>
         <w:t>，加入了</w:t>
       </w:r>
-      <w:r>
-        <w:rPr>
-          <w:rFonts w:hint="eastAsia"/>
-          <w:sz w:val="24"/>
-          <w:szCs w:val="24"/>
-        </w:rPr>
-        <w:t>thpool_add_work()</w:t>
+      <w:proofErr w:type="spellStart"/>
+      <w:r>
+        <w:rPr>
+          <w:rFonts w:hint="eastAsia"/>
+          <w:sz w:val="24"/>
+          <w:szCs w:val="24"/>
+        </w:rPr>
+        <w:t>thpool_add_work</w:t>
+      </w:r>
+      <w:proofErr w:type="spellEnd"/>
+      <w:r>
+        <w:rPr>
+          <w:rFonts w:hint="eastAsia"/>
+          <w:sz w:val="24"/>
+          <w:szCs w:val="24"/>
+        </w:rPr>
+        <w:t>()</w:t>
       </w:r>
       <w:r>
         <w:rPr>
@@ -2841,6 +2993,7 @@
         </w:rPr>
         <w:t>返回</w:t>
       </w:r>
+      <w:proofErr w:type="spellStart"/>
       <w:r>
         <w:rPr>
           <w:rFonts w:hint="eastAsia"/>
@@ -2849,6 +3002,7 @@
         </w:rPr>
         <w:t>client_sock</w:t>
       </w:r>
+      <w:proofErr w:type="spellEnd"/>
       <w:r>
         <w:rPr>
           <w:rFonts w:hint="eastAsia"/>
@@ -2895,7 +3049,97 @@
           <w:sz w:val="18"/>
           <w:szCs w:val="18"/>
         </w:rPr>
-        <w:t>thpool_add_work(thpool,(void*)accept_request,(void*)(uintptr_t)client_sock);</w:t>
+        <w:t>thpool_add_work(</w:t>
+      </w:r>
+      <w:proofErr w:type="gramStart"/>
+      <w:r>
+        <w:rPr>
+          <w:rFonts w:ascii="Consolas" w:hAnsi="Consolas"/>
+          <w:sz w:val="18"/>
+          <w:szCs w:val="18"/>
+        </w:rPr>
+        <w:t>thpool,(</w:t>
+      </w:r>
+      <w:proofErr w:type="gramEnd"/>
+      <w:r>
+        <w:rPr>
+          <w:rFonts w:ascii="Consolas" w:hAnsi="Consolas"/>
+          <w:sz w:val="18"/>
+          <w:szCs w:val="18"/>
+        </w:rPr>
+        <w:t>void</w:t>
+      </w:r>
+      <w:proofErr w:type="gramStart"/>
+      <w:r>
+        <w:rPr>
+          <w:rFonts w:ascii="Consolas" w:hAnsi="Consolas"/>
+          <w:sz w:val="18"/>
+          <w:szCs w:val="18"/>
+        </w:rPr>
+        <w:t>*)accept</w:t>
+      </w:r>
+      <w:proofErr w:type="gramEnd"/>
+      <w:r>
+        <w:rPr>
+          <w:rFonts w:ascii="Consolas" w:hAnsi="Consolas"/>
+          <w:sz w:val="18"/>
+          <w:szCs w:val="18"/>
+        </w:rPr>
+        <w:t>_</w:t>
+      </w:r>
+      <w:proofErr w:type="gramStart"/>
+      <w:r>
+        <w:rPr>
+          <w:rFonts w:ascii="Consolas" w:hAnsi="Consolas"/>
+          <w:sz w:val="18"/>
+          <w:szCs w:val="18"/>
+        </w:rPr>
+        <w:t>request,(</w:t>
+      </w:r>
+      <w:proofErr w:type="gramEnd"/>
+      <w:r>
+        <w:rPr>
+          <w:rFonts w:ascii="Consolas" w:hAnsi="Consolas"/>
+          <w:sz w:val="18"/>
+          <w:szCs w:val="18"/>
+        </w:rPr>
+        <w:t>void</w:t>
+      </w:r>
+      <w:proofErr w:type="gramStart"/>
+      <w:r>
+        <w:rPr>
+          <w:rFonts w:ascii="Consolas" w:hAnsi="Consolas"/>
+          <w:sz w:val="18"/>
+          <w:szCs w:val="18"/>
+        </w:rPr>
+        <w:t>*)(</w:t>
+      </w:r>
+      <w:proofErr w:type="gramEnd"/>
+      <w:r>
+        <w:rPr>
+          <w:rFonts w:ascii="Consolas" w:hAnsi="Consolas"/>
+          <w:sz w:val="18"/>
+          <w:szCs w:val="18"/>
+        </w:rPr>
+        <w:t>uintptr_</w:t>
+      </w:r>
+      <w:proofErr w:type="gramStart"/>
+      <w:r>
+        <w:rPr>
+          <w:rFonts w:ascii="Consolas" w:hAnsi="Consolas"/>
+          <w:sz w:val="18"/>
+          <w:szCs w:val="18"/>
+        </w:rPr>
+        <w:t>t)client</w:t>
+      </w:r>
+      <w:proofErr w:type="gramEnd"/>
+      <w:r>
+        <w:rPr>
+          <w:rFonts w:ascii="Consolas" w:hAnsi="Consolas"/>
+          <w:sz w:val="18"/>
+          <w:szCs w:val="18"/>
+        </w:rPr>
+        <w:t>_sock);</w:t>
       </w:r>
       <w:r>
         <w:rPr>
@@ -2960,7 +3204,25 @@
           <w:sz w:val="24"/>
           <w:szCs w:val="24"/>
         </w:rPr>
-        <w:t>梳理高并发场景下零死锁的生成逻辑，</w:t>
+        <w:t>梳理高并发</w:t>
+      </w:r>
+      <w:proofErr w:type="gramStart"/>
+      <w:r>
+        <w:rPr>
+          <w:rFonts w:hint="eastAsia"/>
+          <w:sz w:val="24"/>
+          <w:szCs w:val="24"/>
+        </w:rPr>
+        <w:t>场景下零死锁</w:t>
+      </w:r>
+      <w:proofErr w:type="gramEnd"/>
+      <w:r>
+        <w:rPr>
+          <w:rFonts w:hint="eastAsia"/>
+          <w:sz w:val="24"/>
+          <w:szCs w:val="24"/>
+        </w:rPr>
+        <w:t>的生成逻辑，</w:t>
       </w:r>
       <w:r>
         <w:rPr>
@@ -3180,13 +3442,23 @@
         </w:rPr>
         <w:t xml:space="preserve">  </w:t>
       </w:r>
+      <w:proofErr w:type="gramStart"/>
       <w:r>
         <w:rPr>
           <w:rFonts w:ascii="Times New Roman" w:eastAsia="宋体" w:hAnsi="Times New Roman" w:cs="Times New Roman"/>
           <w:sz w:val="21"/>
           <w:szCs w:val="21"/>
         </w:rPr>
-        <w:t>线程池锁机制图</w:t>
+        <w:t>线程池锁机制</w:t>
+      </w:r>
+      <w:proofErr w:type="gramEnd"/>
+      <w:r>
+        <w:rPr>
+          <w:rFonts w:ascii="Times New Roman" w:eastAsia="宋体" w:hAnsi="Times New Roman" w:cs="Times New Roman"/>
+          <w:sz w:val="21"/>
+          <w:szCs w:val="21"/>
+        </w:rPr>
+        <w:t>图</w:t>
       </w:r>
     </w:p>
     <w:p>
@@ -3221,6 +3493,7 @@
         </w:rPr>
         <w:t>主线程承担生产者角色，调用</w:t>
       </w:r>
+      <w:proofErr w:type="spellStart"/>
       <w:r>
         <w:rPr>
           <w:rFonts w:hint="eastAsia"/>
@@ -3229,6 +3502,7 @@
         </w:rPr>
         <w:t>add_work</w:t>
       </w:r>
+      <w:proofErr w:type="spellEnd"/>
       <w:r>
         <w:rPr>
           <w:rFonts w:hint="eastAsia"/>
@@ -3332,7 +3606,23 @@
           <w:sz w:val="28"/>
           <w:szCs w:val="28"/>
         </w:rPr>
-        <w:t>动态执行：多进程与管道重定向</w:t>
+        <w:t>动态执行：</w:t>
+      </w:r>
+      <w:proofErr w:type="gramStart"/>
+      <w:r>
+        <w:rPr>
+          <w:sz w:val="28"/>
+          <w:szCs w:val="28"/>
+        </w:rPr>
+        <w:t>多进程</w:t>
+      </w:r>
+      <w:proofErr w:type="gramEnd"/>
+      <w:r>
+        <w:rPr>
+          <w:sz w:val="28"/>
+          <w:szCs w:val="28"/>
+        </w:rPr>
+        <w:t>与管道重定向</w:t>
       </w:r>
     </w:p>
     <w:p>
@@ -3359,6 +3649,7 @@
         </w:rPr>
         <w:t>处理并发调整内存占用之外，原版</w:t>
       </w:r>
+      <w:proofErr w:type="spellStart"/>
       <w:r>
         <w:rPr>
           <w:rFonts w:hint="eastAsia"/>
@@ -3367,6 +3658,7 @@
         </w:rPr>
         <w:t>execute_cgi</w:t>
       </w:r>
+      <w:proofErr w:type="spellEnd"/>
       <w:r>
         <w:rPr>
           <w:rFonts w:hint="eastAsia"/>
@@ -3446,7 +3738,25 @@
           <w:sz w:val="24"/>
           <w:szCs w:val="24"/>
         </w:rPr>
-        <w:t>处理动态请求过程中，主进程调用</w:t>
+        <w:t>处理动态请求过程中，</w:t>
+      </w:r>
+      <w:proofErr w:type="gramStart"/>
+      <w:r>
+        <w:rPr>
+          <w:rFonts w:hint="eastAsia"/>
+          <w:sz w:val="24"/>
+          <w:szCs w:val="24"/>
+        </w:rPr>
+        <w:t>主进程</w:t>
+      </w:r>
+      <w:proofErr w:type="gramEnd"/>
+      <w:r>
+        <w:rPr>
+          <w:rFonts w:hint="eastAsia"/>
+          <w:sz w:val="24"/>
+          <w:szCs w:val="24"/>
+        </w:rPr>
+        <w:t>调用</w:t>
       </w:r>
       <w:r>
         <w:rPr>
@@ -3478,7 +3788,25 @@
           <w:sz w:val="24"/>
           <w:szCs w:val="24"/>
         </w:rPr>
-        <w:t xml:space="preserve"> execl() </w:t>
+        <w:t xml:space="preserve"> </w:t>
+      </w:r>
+      <w:proofErr w:type="spellStart"/>
+      <w:r>
+        <w:rPr>
+          <w:rFonts w:hint="eastAsia"/>
+          <w:sz w:val="24"/>
+          <w:szCs w:val="24"/>
+        </w:rPr>
+        <w:t>execl</w:t>
+      </w:r>
+      <w:proofErr w:type="spellEnd"/>
+      <w:r>
+        <w:rPr>
+          <w:rFonts w:hint="eastAsia"/>
+          <w:sz w:val="24"/>
+          <w:szCs w:val="24"/>
+        </w:rPr>
+        <w:t xml:space="preserve">() </w:t>
       </w:r>
       <w:r>
         <w:rPr>
@@ -3605,13 +3933,23 @@
         </w:rPr>
         <w:t>，名称为</w:t>
       </w:r>
-      <w:r>
-        <w:rPr>
-          <w:rFonts w:hint="eastAsia"/>
-          <w:sz w:val="24"/>
-          <w:szCs w:val="24"/>
-        </w:rPr>
-        <w:t xml:space="preserve">cgi_input </w:t>
+      <w:proofErr w:type="spellStart"/>
+      <w:r>
+        <w:rPr>
+          <w:rFonts w:hint="eastAsia"/>
+          <w:sz w:val="24"/>
+          <w:szCs w:val="24"/>
+        </w:rPr>
+        <w:t>cgi_input</w:t>
+      </w:r>
+      <w:proofErr w:type="spellEnd"/>
+      <w:r>
+        <w:rPr>
+          <w:rFonts w:hint="eastAsia"/>
+          <w:sz w:val="24"/>
+          <w:szCs w:val="24"/>
+        </w:rPr>
+        <w:t xml:space="preserve"> </w:t>
       </w:r>
       <w:r>
         <w:rPr>
@@ -3627,8 +3965,18 @@
           <w:sz w:val="24"/>
           <w:szCs w:val="24"/>
         </w:rPr>
-        <w:t xml:space="preserve"> cgi_output</w:t>
-      </w:r>
+        <w:t xml:space="preserve"> </w:t>
+      </w:r>
+      <w:proofErr w:type="spellStart"/>
+      <w:r>
+        <w:rPr>
+          <w:rFonts w:hint="eastAsia"/>
+          <w:sz w:val="24"/>
+          <w:szCs w:val="24"/>
+        </w:rPr>
+        <w:t>cgi_output</w:t>
+      </w:r>
+      <w:proofErr w:type="spellEnd"/>
       <w:r>
         <w:rPr>
           <w:rFonts w:hint="eastAsia"/>
@@ -3936,13 +4284,23 @@
         </w:rPr>
         <w:t xml:space="preserve">  CGI </w:t>
       </w:r>
+      <w:proofErr w:type="gramStart"/>
       <w:r>
         <w:rPr>
           <w:rFonts w:ascii="Times New Roman" w:eastAsia="宋体" w:hAnsi="Times New Roman" w:cs="Times New Roman"/>
           <w:sz w:val="21"/>
           <w:szCs w:val="21"/>
         </w:rPr>
-        <w:t>多进程通信图</w:t>
+        <w:t>多进程</w:t>
+      </w:r>
+      <w:proofErr w:type="gramEnd"/>
+      <w:r>
+        <w:rPr>
+          <w:rFonts w:ascii="Times New Roman" w:eastAsia="宋体" w:hAnsi="Times New Roman" w:cs="Times New Roman"/>
+          <w:sz w:val="21"/>
+          <w:szCs w:val="21"/>
+        </w:rPr>
+        <w:t>通信图</w:t>
       </w:r>
     </w:p>
     <w:p>
@@ -4016,85 +4374,39 @@
         </w:rPr>
       </w:pPr>
       <w:r>
-        <w:rPr>
-          <w:rFonts w:hint="eastAsia"/>
-          <w:color w:val="FF0000"/>
-          <w:sz w:val="24"/>
-          <w:szCs w:val="24"/>
-        </w:rPr>
-        <w:t xml:space="preserve">    </w:t>
-      </w:r>
-      <w:r>
-        <w:rPr>
-          <w:rFonts w:hint="eastAsia"/>
-          <w:sz w:val="24"/>
-          <w:szCs w:val="24"/>
-        </w:rPr>
-        <w:t>本次测试选用</w:t>
-      </w:r>
-      <w:r>
-        <w:rPr>
-          <w:rFonts w:hint="eastAsia"/>
-          <w:sz w:val="24"/>
-          <w:szCs w:val="24"/>
-        </w:rPr>
+        <w:t>本次测试使用</w:t>
+      </w:r>
+      <w:r>
+        <w:t xml:space="preserve"> Apache Benchmark</w:t>
+      </w:r>
+      <w:r>
+        <w:t>（</w:t>
+      </w:r>
+      <w:r>
         <w:t>ab</w:t>
       </w:r>
       <w:r>
-        <w:rPr>
-          <w:rFonts w:hint="eastAsia"/>
-          <w:sz w:val="24"/>
-          <w:szCs w:val="24"/>
-        </w:rPr>
-        <w:t>，即</w:t>
-      </w:r>
-      <w:r>
-        <w:rPr>
-          <w:rFonts w:hint="eastAsia"/>
-          <w:sz w:val="24"/>
-          <w:szCs w:val="24"/>
-        </w:rPr>
-        <w:t>Apache Benchmark</w:t>
-      </w:r>
-      <w:r>
-        <w:rPr>
-          <w:rFonts w:hint="eastAsia"/>
-          <w:sz w:val="24"/>
-          <w:szCs w:val="24"/>
-        </w:rPr>
-        <w:t>，分别对原版代码和重构版代码完成对比测试，测试设定并发数为</w:t>
-      </w:r>
-      <w:r>
-        <w:rPr>
-          <w:rFonts w:hint="eastAsia"/>
-          <w:sz w:val="24"/>
-          <w:szCs w:val="24"/>
-        </w:rPr>
-        <w:t>1000</w:t>
-      </w:r>
-      <w:r>
-        <w:rPr>
-          <w:rFonts w:hint="eastAsia"/>
-          <w:sz w:val="24"/>
-          <w:szCs w:val="24"/>
-        </w:rPr>
-        <w:t>，请求总数为</w:t>
-      </w:r>
-      <w:r>
-        <w:rPr>
-          <w:rFonts w:hint="eastAsia"/>
-          <w:sz w:val="24"/>
-          <w:szCs w:val="24"/>
-        </w:rPr>
-        <w:t>2000</w:t>
-      </w:r>
-      <w:r>
-        <w:rPr>
-          <w:rFonts w:hint="eastAsia"/>
-          <w:sz w:val="24"/>
-          <w:szCs w:val="24"/>
-        </w:rPr>
-        <w:t>。</w:t>
+        <w:t>）完成。为了让对比尽量公平，我们先统一采用</w:t>
+      </w:r>
+      <w:r>
+        <w:t xml:space="preserve"> ab -n 2000 -c 1000 -k http://127.0.0.1:4000/</w:t>
+      </w:r>
+      <w:r>
+        <w:t>，分别测试原版</w:t>
+      </w:r>
+      <w:r>
+        <w:t xml:space="preserve"> </w:t>
+      </w:r>
+      <w:proofErr w:type="spellStart"/>
+      <w:r>
+        <w:t>Tinyhttpd</w:t>
+      </w:r>
+      <w:proofErr w:type="spellEnd"/>
+      <w:r>
+        <w:t xml:space="preserve"> </w:t>
+      </w:r>
+      <w:r>
+        <w:t>和重构版。除此之外，我们又单独对重构版补做了一次更长时间的压测，用来观察它在持续高并发下的表现。</w:t>
       </w:r>
     </w:p>
     <w:p>
@@ -4239,7 +4551,13 @@
         <w:t>测试结果</w:t>
       </w:r>
     </w:p>
-    <w:p/>
+    <w:p>
+      <w:pPr>
+        <w:rPr>
+          <w:rFonts w:hint="eastAsia"/>
+        </w:rPr>
+      </w:pPr>
+    </w:p>
     <w:tbl>
       <w:tblPr>
         <w:tblW w:w="0" w:type="auto"/>
@@ -4259,7 +4577,7 @@
       </w:tblGrid>
       <w:tr>
         <w:trPr>
-          <w:trHeight w:val="390"/>
+          <w:trHeight w:val="23"/>
           <w:tblHeader/>
           <w:tblCellSpacing w:w="15" w:type="dxa"/>
         </w:trPr>
@@ -4341,6 +4659,7 @@
               </w:rPr>
               <w:t>原版</w:t>
             </w:r>
+            <w:proofErr w:type="spellStart"/>
             <w:r>
               <w:rPr>
                 <w:b/>
@@ -4350,6 +4669,7 @@
               </w:rPr>
               <w:t>Tinyhttpd</w:t>
             </w:r>
+            <w:proofErr w:type="spellEnd"/>
           </w:p>
         </w:tc>
         <w:tc>
@@ -4444,7 +4764,7 @@
       </w:tr>
       <w:tr>
         <w:trPr>
-          <w:trHeight w:val="390"/>
+          <w:trHeight w:val="20"/>
           <w:tblCellSpacing w:w="15" w:type="dxa"/>
         </w:trPr>
         <w:tc>
@@ -4466,33 +4786,13 @@
             <w:hideMark/>
           </w:tcPr>
           <w:p>
-            <w:pPr>
-              <w:spacing w:line="300" w:lineRule="auto"/>
-              <w:jc w:val="center"/>
-              <w:rPr>
-                <w:sz w:val="24"/>
-                <w:szCs w:val="24"/>
-              </w:rPr>
-            </w:pPr>
             <w:r>
-              <w:rPr>
-                <w:sz w:val="24"/>
-                <w:szCs w:val="24"/>
-              </w:rPr>
               <w:t>RPS (</w:t>
             </w:r>
             <w:r>
-              <w:rPr>
-                <w:sz w:val="24"/>
-                <w:szCs w:val="24"/>
-              </w:rPr>
               <w:t>吞吐量</w:t>
             </w:r>
             <w:r>
-              <w:rPr>
-                <w:sz w:val="24"/>
-                <w:szCs w:val="24"/>
-              </w:rPr>
               <w:t>)</w:t>
             </w:r>
           </w:p>
@@ -4516,34 +4816,8 @@
             <w:hideMark/>
           </w:tcPr>
           <w:p>
-            <w:pPr>
-              <w:spacing w:line="300" w:lineRule="auto"/>
-              <w:rPr>
-                <w:sz w:val="24"/>
-                <w:szCs w:val="24"/>
-              </w:rPr>
-            </w:pPr>
             <w:r>
-              <w:rPr>
-                <w:sz w:val="24"/>
-                <w:szCs w:val="24"/>
-              </w:rPr>
-              <w:t>2298.44</w:t>
-            </w:r>
-            <w:r>
-              <w:rPr>
-                <w:rFonts w:hint="eastAsia"/>
-                <w:sz w:val="24"/>
-                <w:szCs w:val="24"/>
-              </w:rPr>
-              <w:t xml:space="preserve"> </w:t>
-            </w:r>
-            <w:r>
-              <w:rPr>
-                <w:sz w:val="24"/>
-                <w:szCs w:val="24"/>
-              </w:rPr>
-              <w:t>[#/sec]</w:t>
+              <w:t>2298.44 [#/sec]</w:t>
             </w:r>
           </w:p>
         </w:tc>
@@ -4566,34 +4840,8 @@
             <w:hideMark/>
           </w:tcPr>
           <w:p>
-            <w:pPr>
-              <w:spacing w:line="300" w:lineRule="auto"/>
-              <w:rPr>
-                <w:sz w:val="24"/>
-                <w:szCs w:val="24"/>
-              </w:rPr>
-            </w:pPr>
             <w:r>
-              <w:rPr>
-                <w:sz w:val="24"/>
-                <w:szCs w:val="24"/>
-              </w:rPr>
-              <w:t>13325.78</w:t>
-            </w:r>
-            <w:r>
-              <w:rPr>
-                <w:rFonts w:hint="eastAsia"/>
-                <w:sz w:val="24"/>
-                <w:szCs w:val="24"/>
-              </w:rPr>
-              <w:t xml:space="preserve"> </w:t>
-            </w:r>
-            <w:r>
-              <w:rPr>
-                <w:sz w:val="24"/>
-                <w:szCs w:val="24"/>
-              </w:rPr>
-              <w:t>[#/sec]</w:t>
+              <w:t>9917.29 [#/sec]</w:t>
             </w:r>
           </w:p>
         </w:tc>
@@ -4616,32 +4864,13 @@
             <w:hideMark/>
           </w:tcPr>
           <w:p>
-            <w:pPr>
-              <w:spacing w:line="300" w:lineRule="auto"/>
-              <w:rPr>
-                <w:sz w:val="24"/>
-                <w:szCs w:val="24"/>
-              </w:rPr>
-            </w:pPr>
             <w:r>
-              <w:rPr>
-                <w:sz w:val="24"/>
-                <w:szCs w:val="24"/>
-              </w:rPr>
               <w:t>提升约</w:t>
             </w:r>
             <w:r>
-              <w:rPr>
-                <w:sz w:val="24"/>
-                <w:szCs w:val="24"/>
-              </w:rPr>
-              <w:t>5.8</w:t>
+              <w:t>4.3</w:t>
             </w:r>
             <w:r>
-              <w:rPr>
-                <w:sz w:val="24"/>
-                <w:szCs w:val="24"/>
-              </w:rPr>
               <w:t>倍</w:t>
             </w:r>
           </w:p>
@@ -4649,7 +4878,7 @@
       </w:tr>
       <w:tr>
         <w:trPr>
-          <w:trHeight w:val="390"/>
+          <w:trHeight w:val="20"/>
           <w:tblCellSpacing w:w="15" w:type="dxa"/>
         </w:trPr>
         <w:tc>
@@ -4671,17 +4900,7 @@
             <w:hideMark/>
           </w:tcPr>
           <w:p>
-            <w:pPr>
-              <w:spacing w:line="300" w:lineRule="auto"/>
-              <w:jc w:val="center"/>
-              <w:rPr>
-                <w:szCs w:val="21"/>
-              </w:rPr>
-            </w:pPr>
             <w:r>
-              <w:rPr>
-                <w:szCs w:val="21"/>
-              </w:rPr>
               <w:t>最长请求耗时</w:t>
             </w:r>
           </w:p>
@@ -4705,34 +4924,14 @@
             <w:hideMark/>
           </w:tcPr>
           <w:p>
-            <w:pPr>
-              <w:spacing w:line="300" w:lineRule="auto"/>
-              <w:rPr>
-                <w:sz w:val="24"/>
-                <w:szCs w:val="24"/>
-              </w:rPr>
-            </w:pPr>
             <w:r>
-              <w:rPr>
-                <w:sz w:val="24"/>
-                <w:szCs w:val="24"/>
-              </w:rPr>
-              <w:t>510</w:t>
+              <w:t xml:space="preserve">510 </w:t>
             </w:r>
+            <w:proofErr w:type="spellStart"/>
             <w:r>
-              <w:rPr>
-                <w:sz w:val="24"/>
-                <w:szCs w:val="24"/>
-              </w:rPr>
-              <w:t xml:space="preserve"> </w:t>
-            </w:r>
-            <w:r>
-              <w:rPr>
-                <w:sz w:val="24"/>
-                <w:szCs w:val="24"/>
-              </w:rPr>
               <w:t>ms</w:t>
             </w:r>
+            <w:proofErr w:type="spellEnd"/>
           </w:p>
         </w:tc>
         <w:tc>
@@ -4754,20 +4953,14 @@
             <w:hideMark/>
           </w:tcPr>
           <w:p>
-            <w:pPr>
-              <w:spacing w:line="300" w:lineRule="auto"/>
-              <w:rPr>
-                <w:sz w:val="24"/>
-                <w:szCs w:val="24"/>
-              </w:rPr>
-            </w:pPr>
             <w:r>
-              <w:rPr>
-                <w:sz w:val="24"/>
-                <w:szCs w:val="24"/>
-              </w:rPr>
-              <w:t>47 ms</w:t>
+              <w:t xml:space="preserve">38 </w:t>
             </w:r>
+            <w:proofErr w:type="spellStart"/>
+            <w:r>
+              <w:t>ms</w:t>
+            </w:r>
+            <w:proofErr w:type="spellEnd"/>
           </w:p>
         </w:tc>
         <w:tc>
@@ -4789,26 +4982,15 @@
             <w:hideMark/>
           </w:tcPr>
           <w:p>
-            <w:pPr>
-              <w:spacing w:line="300" w:lineRule="auto"/>
-              <w:rPr>
-                <w:sz w:val="24"/>
-                <w:szCs w:val="24"/>
-              </w:rPr>
-            </w:pPr>
             <w:r>
-              <w:rPr>
-                <w:sz w:val="24"/>
-                <w:szCs w:val="24"/>
-              </w:rPr>
-              <w:t>延迟大幅降低</w:t>
+              <w:t>延迟明显下降</w:t>
             </w:r>
           </w:p>
         </w:tc>
       </w:tr>
       <w:tr>
         <w:trPr>
-          <w:trHeight w:val="390"/>
+          <w:trHeight w:val="79"/>
           <w:tblCellSpacing w:w="15" w:type="dxa"/>
         </w:trPr>
         <w:tc>
@@ -4830,19 +5012,7 @@
             <w:hideMark/>
           </w:tcPr>
           <w:p>
-            <w:pPr>
-              <w:spacing w:line="300" w:lineRule="auto"/>
-              <w:jc w:val="center"/>
-              <w:rPr>
-                <w:sz w:val="24"/>
-                <w:szCs w:val="24"/>
-              </w:rPr>
-            </w:pPr>
             <w:r>
-              <w:rPr>
-                <w:sz w:val="24"/>
-                <w:szCs w:val="24"/>
-              </w:rPr>
               <w:t>失败请求数</w:t>
             </w:r>
           </w:p>
@@ -4866,20 +5036,8 @@
             <w:hideMark/>
           </w:tcPr>
           <w:p>
-            <w:pPr>
-              <w:spacing w:line="300" w:lineRule="auto"/>
-              <w:jc w:val="left"/>
-              <w:rPr>
-                <w:sz w:val="24"/>
-                <w:szCs w:val="24"/>
-              </w:rPr>
-            </w:pPr>
             <w:r>
-              <w:rPr>
-                <w:sz w:val="24"/>
-                <w:szCs w:val="24"/>
-              </w:rPr>
-              <w:t>4</w:t>
+              <w:t>0</w:t>
             </w:r>
           </w:p>
         </w:tc>
@@ -4902,18 +5060,7 @@
             <w:hideMark/>
           </w:tcPr>
           <w:p>
-            <w:pPr>
-              <w:spacing w:line="300" w:lineRule="auto"/>
-              <w:rPr>
-                <w:sz w:val="24"/>
-                <w:szCs w:val="24"/>
-              </w:rPr>
-            </w:pPr>
             <w:r>
-              <w:rPr>
-                <w:sz w:val="24"/>
-                <w:szCs w:val="24"/>
-              </w:rPr>
               <w:t>0</w:t>
             </w:r>
           </w:p>
@@ -4937,30 +5084,11 @@
             <w:hideMark/>
           </w:tcPr>
           <w:p>
-            <w:pPr>
-              <w:keepNext/>
-              <w:spacing w:line="300" w:lineRule="auto"/>
-              <w:rPr>
-                <w:szCs w:val="21"/>
-              </w:rPr>
-            </w:pPr>
             <w:r>
-              <w:rPr>
-                <w:szCs w:val="21"/>
-              </w:rPr>
-              <w:t>高压</w:t>
+              <w:t>两者均为</w:t>
             </w:r>
             <w:r>
-              <w:rPr>
-                <w:szCs w:val="21"/>
-              </w:rPr>
-              <w:t>力</w:t>
-            </w:r>
-            <w:r>
-              <w:rPr>
-                <w:szCs w:val="21"/>
-              </w:rPr>
-              <w:t>下零崩溃</w:t>
+              <w:t>0</w:t>
             </w:r>
           </w:p>
         </w:tc>
@@ -5067,120 +5195,121 @@
         </w:rPr>
       </w:pPr>
       <w:r>
-        <w:rPr>
-          <w:rFonts w:hint="eastAsia"/>
-          <w:b/>
-          <w:bCs/>
-          <w:sz w:val="24"/>
-          <w:szCs w:val="24"/>
-        </w:rPr>
         <w:lastRenderedPageBreak/>
-        <w:t>分析</w:t>
-      </w:r>
-      <w:r>
-        <w:rPr>
-          <w:b/>
-          <w:bCs/>
-          <w:sz w:val="24"/>
-          <w:szCs w:val="24"/>
-        </w:rPr>
-        <w:t>结论：</w:t>
-      </w:r>
-      <w:r>
-        <w:rPr>
-          <w:rFonts w:hint="eastAsia"/>
-          <w:sz w:val="24"/>
-          <w:szCs w:val="24"/>
-        </w:rPr>
-        <w:t>从实测数据可以看到，服务器性能有提高，</w:t>
-      </w:r>
-      <w:r>
-        <w:rPr>
-          <w:rFonts w:hint="eastAsia"/>
-          <w:sz w:val="24"/>
-          <w:szCs w:val="24"/>
-        </w:rPr>
-        <w:t>RPS</w:t>
-      </w:r>
-      <w:r>
-        <w:rPr>
-          <w:rFonts w:hint="eastAsia"/>
-          <w:sz w:val="24"/>
-          <w:szCs w:val="24"/>
-        </w:rPr>
-        <w:t>数值超过</w:t>
-      </w:r>
-      <w:r>
-        <w:rPr>
-          <w:rFonts w:hint="eastAsia"/>
-          <w:sz w:val="24"/>
-          <w:szCs w:val="24"/>
-        </w:rPr>
-        <w:t>1.3</w:t>
-      </w:r>
-      <w:r>
-        <w:rPr>
-          <w:rFonts w:hint="eastAsia"/>
-          <w:sz w:val="24"/>
-          <w:szCs w:val="24"/>
-        </w:rPr>
-        <w:t>万，在</w:t>
-      </w:r>
-      <w:r>
-        <w:rPr>
-          <w:rFonts w:hint="eastAsia"/>
-          <w:sz w:val="24"/>
-          <w:szCs w:val="24"/>
-        </w:rPr>
-        <w:t>1000</w:t>
-      </w:r>
-      <w:r>
-        <w:rPr>
-          <w:rFonts w:hint="eastAsia"/>
-          <w:sz w:val="24"/>
-          <w:szCs w:val="24"/>
-        </w:rPr>
-        <w:t>并发的高压测试环境中，测试全程失败率为</w:t>
-      </w:r>
-      <w:r>
-        <w:rPr>
-          <w:rFonts w:hint="eastAsia"/>
-          <w:sz w:val="24"/>
-          <w:szCs w:val="24"/>
-        </w:rPr>
-        <w:t>0</w:t>
-      </w:r>
-      <w:r>
-        <w:rPr>
-          <w:rFonts w:hint="eastAsia"/>
-          <w:sz w:val="24"/>
-          <w:szCs w:val="24"/>
-        </w:rPr>
-        <w:t>。</w:t>
-      </w:r>
-      <w:r>
-        <w:rPr>
-          <w:rFonts w:hint="eastAsia"/>
-          <w:sz w:val="24"/>
-          <w:szCs w:val="24"/>
-        </w:rPr>
-        <w:t>这一</w:t>
-      </w:r>
-      <w:r>
-        <w:rPr>
-          <w:rFonts w:hint="eastAsia"/>
-          <w:sz w:val="24"/>
-          <w:szCs w:val="24"/>
-        </w:rPr>
-        <w:t>性能变化来自两项核心优化</w:t>
-      </w:r>
-      <w:r>
-        <w:rPr>
-          <w:rFonts w:hint="eastAsia"/>
-          <w:sz w:val="24"/>
-          <w:szCs w:val="24"/>
-        </w:rPr>
-        <w:t>：</w:t>
+        <w:t>分析结论：如果只看相</w:t>
+      </w:r>
+      <w:proofErr w:type="gramStart"/>
+      <w:r>
+        <w:t>同命令</w:t>
+      </w:r>
+      <w:proofErr w:type="gramEnd"/>
+      <w:r>
+        <w:t>下的横向对比，重构版在</w:t>
+      </w:r>
+      <w:r>
+        <w:t xml:space="preserve"> ab -n 2000 -c 1000 -k </w:t>
+      </w:r>
+      <w:r>
+        <w:t>这组测试中的吞吐量从</w:t>
+      </w:r>
+      <w:r>
+        <w:t xml:space="preserve"> 2298.44 RPS </w:t>
+      </w:r>
+      <w:r>
+        <w:t>提高到了</w:t>
+      </w:r>
+      <w:r>
+        <w:t xml:space="preserve"> 9917.29 RPS</w:t>
+      </w:r>
+      <w:r>
+        <w:t>，最长请求时间也从</w:t>
+      </w:r>
+      <w:r>
+        <w:t xml:space="preserve"> 510 </w:t>
+      </w:r>
+      <w:proofErr w:type="spellStart"/>
+      <w:r>
+        <w:t>ms</w:t>
+      </w:r>
+      <w:proofErr w:type="spellEnd"/>
+      <w:r>
+        <w:t xml:space="preserve"> </w:t>
+      </w:r>
+      <w:r>
+        <w:t>降到了</w:t>
+      </w:r>
+      <w:r>
+        <w:t xml:space="preserve"> 38 </w:t>
+      </w:r>
+      <w:proofErr w:type="spellStart"/>
+      <w:r>
+        <w:t>ms</w:t>
+      </w:r>
+      <w:proofErr w:type="spellEnd"/>
+      <w:r>
+        <w:t>，两边的失败请求都为</w:t>
+      </w:r>
+      <w:r>
+        <w:t xml:space="preserve"> 0</w:t>
+      </w:r>
+      <w:r>
+        <w:t>。这更能说明线程池和</w:t>
+      </w:r>
+      <w:r>
+        <w:t xml:space="preserve"> SDS </w:t>
+      </w:r>
+      <w:r>
+        <w:t>改造对并发处理效率带来的直接提升。</w:t>
+      </w:r>
+    </w:p>
+    <w:p>
+      <w:r>
+        <w:t>除此之外，我们又单独对重构版补做了一次</w:t>
+      </w:r>
+      <w:r>
+        <w:t xml:space="preserve"> ab -n 10000 -c 1000 </w:t>
+      </w:r>
+      <w:r>
+        <w:t>的长时间压力测试，最终测得</w:t>
+      </w:r>
+      <w:r>
+        <w:t xml:space="preserve"> 13325.78 RPS</w:t>
+      </w:r>
+      <w:r>
+        <w:t>，最长请求耗时</w:t>
+      </w:r>
+      <w:r>
+        <w:t xml:space="preserve"> 47 </w:t>
+      </w:r>
+      <w:proofErr w:type="spellStart"/>
+      <w:r>
+        <w:t>ms</w:t>
+      </w:r>
+      <w:proofErr w:type="spellEnd"/>
+      <w:r>
+        <w:t>，失败请求仍为</w:t>
+      </w:r>
+      <w:r>
+        <w:t xml:space="preserve"> 0</w:t>
+      </w:r>
+      <w:r>
+        <w:t>。这组数据更适合说明改进版在持续高并发下依然能保持较好的稳定性。需要说明的是，</w:t>
+      </w:r>
+      <w:proofErr w:type="gramStart"/>
+      <w:r>
+        <w:t>压测数据采集</w:t>
+      </w:r>
+      <w:proofErr w:type="gramEnd"/>
+      <w:r>
+        <w:t>于基准测试版本，后续仓库中又加入了</w:t>
+      </w:r>
+      <w:proofErr w:type="gramStart"/>
+      <w:r>
+        <w:t>个人博客页面</w:t>
+      </w:r>
+      <w:proofErr w:type="gramEnd"/>
+      <w:r>
+        <w:t>和更多静态资源，因此当前站点内容与压测时使用的首页资源并不完全相同。</w:t>
       </w:r>
     </w:p>
     <w:p>
@@ -5203,6 +5332,7 @@
         </w:rPr>
         <w:t>规避</w:t>
       </w:r>
+      <w:proofErr w:type="spellStart"/>
       <w:r>
         <w:rPr>
           <w:rFonts w:hint="eastAsia"/>
@@ -5219,6 +5349,7 @@
         </w:rPr>
         <w:t>l</w:t>
       </w:r>
+      <w:proofErr w:type="spellEnd"/>
       <w:r>
         <w:rPr>
           <w:rFonts w:hint="eastAsia"/>
@@ -5283,13 +5414,23 @@
         </w:rPr>
         <w:t>CPU</w:t>
       </w:r>
-      <w:r>
-        <w:rPr>
-          <w:rFonts w:hint="eastAsia"/>
-          <w:sz w:val="24"/>
-          <w:szCs w:val="24"/>
-        </w:rPr>
-        <w:t>算力可全部投入网络</w:t>
+      <w:proofErr w:type="gramStart"/>
+      <w:r>
+        <w:rPr>
+          <w:rFonts w:hint="eastAsia"/>
+          <w:sz w:val="24"/>
+          <w:szCs w:val="24"/>
+        </w:rPr>
+        <w:t>算力可</w:t>
+      </w:r>
+      <w:proofErr w:type="gramEnd"/>
+      <w:r>
+        <w:rPr>
+          <w:rFonts w:hint="eastAsia"/>
+          <w:sz w:val="24"/>
+          <w:szCs w:val="24"/>
+        </w:rPr>
+        <w:t>全部投入网络</w:t>
       </w:r>
       <w:r>
         <w:rPr>
@@ -5335,7 +5476,43 @@
           <w:sz w:val="24"/>
           <w:szCs w:val="24"/>
         </w:rPr>
-        <w:t>内存管控精度调整部分：原版实现中，程序直接在栈空间分配固定大小的大型数组，存在溢出风险，还会占用多余空间</w:t>
+        <w:t>内存管控精度调整部分：</w:t>
+      </w:r>
+      <w:proofErr w:type="gramStart"/>
+      <w:r>
+        <w:rPr>
+          <w:rFonts w:hint="eastAsia"/>
+          <w:sz w:val="24"/>
+          <w:szCs w:val="24"/>
+        </w:rPr>
+        <w:t>原版实现</w:t>
+      </w:r>
+      <w:proofErr w:type="gramEnd"/>
+      <w:r>
+        <w:rPr>
+          <w:rFonts w:hint="eastAsia"/>
+          <w:sz w:val="24"/>
+          <w:szCs w:val="24"/>
+        </w:rPr>
+        <w:t>中，程序直接在</w:t>
+      </w:r>
+      <w:proofErr w:type="gramStart"/>
+      <w:r>
+        <w:rPr>
+          <w:rFonts w:hint="eastAsia"/>
+          <w:sz w:val="24"/>
+          <w:szCs w:val="24"/>
+        </w:rPr>
+        <w:t>栈</w:t>
+      </w:r>
+      <w:proofErr w:type="gramEnd"/>
+      <w:r>
+        <w:rPr>
+          <w:rFonts w:hint="eastAsia"/>
+          <w:sz w:val="24"/>
+          <w:szCs w:val="24"/>
+        </w:rPr>
+        <w:t>空间分配固定大小的大型数组，存在溢出风险，还会占用多余空间</w:t>
       </w:r>
       <w:r>
         <w:rPr>
@@ -5624,7 +5801,23 @@
           <w:sz w:val="24"/>
           <w:szCs w:val="24"/>
         </w:rPr>
-        <w:t>error: 'sh' undeclared</w:t>
+        <w:t>error: '</w:t>
+      </w:r>
+      <w:proofErr w:type="spellStart"/>
+      <w:r>
+        <w:rPr>
+          <w:sz w:val="24"/>
+          <w:szCs w:val="24"/>
+        </w:rPr>
+        <w:t>sh</w:t>
+      </w:r>
+      <w:proofErr w:type="spellEnd"/>
+      <w:r>
+        <w:rPr>
+          <w:sz w:val="24"/>
+          <w:szCs w:val="24"/>
+        </w:rPr>
+        <w:t>' undeclared</w:t>
       </w:r>
       <w:r>
         <w:rPr>
@@ -5696,6 +5889,7 @@
         </w:rPr>
         <w:t>问题出在</w:t>
       </w:r>
+      <w:proofErr w:type="spellStart"/>
       <w:r>
         <w:rPr>
           <w:sz w:val="24"/>
@@ -5703,6 +5897,7 @@
         </w:rPr>
         <w:t>sds.h</w:t>
       </w:r>
+      <w:proofErr w:type="spellEnd"/>
       <w:r>
         <w:rPr>
           <w:sz w:val="24"/>
@@ -5710,6 +5905,7 @@
         </w:rPr>
         <w:t>文件内的</w:t>
       </w:r>
+      <w:proofErr w:type="spellStart"/>
       <w:r>
         <w:rPr>
           <w:sz w:val="24"/>
@@ -5717,6 +5913,7 @@
         </w:rPr>
         <w:t>sdsavail</w:t>
       </w:r>
+      <w:proofErr w:type="spellEnd"/>
       <w:r>
         <w:rPr>
           <w:sz w:val="24"/>
@@ -5871,7 +6068,39 @@
           <w:sz w:val="24"/>
           <w:szCs w:val="24"/>
         </w:rPr>
-        <w:t>(s)-(sizeof(struct sdshdr##T))</w:t>
+        <w:t>(s)-(</w:t>
+      </w:r>
+      <w:proofErr w:type="spellStart"/>
+      <w:r>
+        <w:rPr>
+          <w:sz w:val="24"/>
+          <w:szCs w:val="24"/>
+        </w:rPr>
+        <w:t>sizeof</w:t>
+      </w:r>
+      <w:proofErr w:type="spellEnd"/>
+      <w:r>
+        <w:rPr>
+          <w:sz w:val="24"/>
+          <w:szCs w:val="24"/>
+        </w:rPr>
+        <w:t xml:space="preserve">(struct </w:t>
+      </w:r>
+      <w:proofErr w:type="spellStart"/>
+      <w:r>
+        <w:rPr>
+          <w:sz w:val="24"/>
+          <w:szCs w:val="24"/>
+        </w:rPr>
+        <w:t>sdshdr</w:t>
+      </w:r>
+      <w:proofErr w:type="spellEnd"/>
+      <w:r>
+        <w:rPr>
+          <w:sz w:val="24"/>
+          <w:szCs w:val="24"/>
+        </w:rPr>
+        <w:t>##T))</w:t>
       </w:r>
       <w:r>
         <w:rPr>
@@ -5892,8 +6121,25 @@
           <w:sz w:val="24"/>
           <w:szCs w:val="24"/>
         </w:rPr>
-        <w:t>真实的结构体头部，宏展开过程中会隐式声明一个名为</w:t>
-      </w:r>
+        <w:t>真实的结构体头部，</w:t>
+      </w:r>
+      <w:proofErr w:type="gramStart"/>
+      <w:r>
+        <w:rPr>
+          <w:sz w:val="24"/>
+          <w:szCs w:val="24"/>
+        </w:rPr>
+        <w:t>宏展开</w:t>
+      </w:r>
+      <w:proofErr w:type="gramEnd"/>
+      <w:r>
+        <w:rPr>
+          <w:sz w:val="24"/>
+          <w:szCs w:val="24"/>
+        </w:rPr>
+        <w:t>过程中会隐式声明一个名为</w:t>
+      </w:r>
+      <w:proofErr w:type="spellStart"/>
       <w:r>
         <w:rPr>
           <w:sz w:val="24"/>
@@ -5901,6 +6147,7 @@
         </w:rPr>
         <w:t>sh</w:t>
       </w:r>
+      <w:proofErr w:type="spellEnd"/>
       <w:r>
         <w:rPr>
           <w:sz w:val="24"/>
@@ -5945,13 +6192,63 @@
         </w:rPr>
         <w:t>。代码中漏写后缀，后续执行</w:t>
       </w:r>
-      <w:r>
-        <w:rPr>
-          <w:sz w:val="24"/>
-          <w:szCs w:val="24"/>
-        </w:rPr>
-        <w:t>sh-&gt;alloc - sh-&gt;len</w:t>
-      </w:r>
+      <w:proofErr w:type="spellStart"/>
+      <w:r>
+        <w:rPr>
+          <w:sz w:val="24"/>
+          <w:szCs w:val="24"/>
+        </w:rPr>
+        <w:t>sh</w:t>
+      </w:r>
+      <w:proofErr w:type="spellEnd"/>
+      <w:r>
+        <w:rPr>
+          <w:sz w:val="24"/>
+          <w:szCs w:val="24"/>
+        </w:rPr>
+        <w:t>-&gt;</w:t>
+      </w:r>
+      <w:proofErr w:type="spellStart"/>
+      <w:r>
+        <w:rPr>
+          <w:sz w:val="24"/>
+          <w:szCs w:val="24"/>
+        </w:rPr>
+        <w:t>alloc</w:t>
+      </w:r>
+      <w:proofErr w:type="spellEnd"/>
+      <w:r>
+        <w:rPr>
+          <w:sz w:val="24"/>
+          <w:szCs w:val="24"/>
+        </w:rPr>
+        <w:t xml:space="preserve"> - </w:t>
+      </w:r>
+      <w:proofErr w:type="spellStart"/>
+      <w:r>
+        <w:rPr>
+          <w:sz w:val="24"/>
+          <w:szCs w:val="24"/>
+        </w:rPr>
+        <w:t>sh</w:t>
+      </w:r>
+      <w:proofErr w:type="spellEnd"/>
+      <w:r>
+        <w:rPr>
+          <w:sz w:val="24"/>
+          <w:szCs w:val="24"/>
+        </w:rPr>
+        <w:t>-&gt;</w:t>
+      </w:r>
+      <w:proofErr w:type="spellStart"/>
+      <w:r>
+        <w:rPr>
+          <w:sz w:val="24"/>
+          <w:szCs w:val="24"/>
+        </w:rPr>
+        <w:t>len</w:t>
+      </w:r>
+      <w:proofErr w:type="spellEnd"/>
       <w:r>
         <w:rPr>
           <w:sz w:val="24"/>
@@ -5959,6 +6256,7 @@
         </w:rPr>
         <w:t>时，无法找到局部变量</w:t>
       </w:r>
+      <w:proofErr w:type="spellStart"/>
       <w:r>
         <w:rPr>
           <w:sz w:val="24"/>
@@ -5966,6 +6264,7 @@
         </w:rPr>
         <w:t>sh</w:t>
       </w:r>
+      <w:proofErr w:type="spellEnd"/>
       <w:r>
         <w:rPr>
           <w:sz w:val="24"/>
@@ -6108,6 +6407,7 @@
         <w:rPr>
           <w:noProof/>
         </w:rPr>
+        <w:lastRenderedPageBreak/>
         <w:drawing>
           <wp:inline distT="0" distB="0" distL="0" distR="0" wp14:anchorId="1AC4D833" wp14:editId="7EBD298C">
             <wp:extent cx="5274945" cy="846455"/>
@@ -6266,7 +6566,6 @@
           <w:sz w:val="28"/>
           <w:szCs w:val="28"/>
         </w:rPr>
-        <w:lastRenderedPageBreak/>
         <w:t>2.</w:t>
       </w:r>
       <w:r>
@@ -6343,7 +6642,43 @@
           <w:sz w:val="24"/>
           <w:szCs w:val="24"/>
         </w:rPr>
-        <w:t>和线程池结合使用时，遇到了一个存在竞态条件的</w:t>
+        <w:t>和线程</w:t>
+      </w:r>
+      <w:proofErr w:type="gramStart"/>
+      <w:r>
+        <w:rPr>
+          <w:rFonts w:hint="eastAsia"/>
+          <w:sz w:val="24"/>
+          <w:szCs w:val="24"/>
+        </w:rPr>
+        <w:t>池结合</w:t>
+      </w:r>
+      <w:proofErr w:type="gramEnd"/>
+      <w:r>
+        <w:rPr>
+          <w:rFonts w:hint="eastAsia"/>
+          <w:sz w:val="24"/>
+          <w:szCs w:val="24"/>
+        </w:rPr>
+        <w:t>使用时，遇到了一个存在</w:t>
+      </w:r>
+      <w:proofErr w:type="gramStart"/>
+      <w:r>
+        <w:rPr>
+          <w:rFonts w:hint="eastAsia"/>
+          <w:sz w:val="24"/>
+          <w:szCs w:val="24"/>
+        </w:rPr>
+        <w:t>竞态条件</w:t>
+      </w:r>
+      <w:proofErr w:type="gramEnd"/>
+      <w:r>
+        <w:rPr>
+          <w:rFonts w:hint="eastAsia"/>
+          <w:sz w:val="24"/>
+          <w:szCs w:val="24"/>
+        </w:rPr>
+        <w:t>的</w:t>
       </w:r>
       <w:r>
         <w:rPr>
@@ -6475,6 +6810,7 @@
         </w:rPr>
         <w:t>观测可确认，工作线程获取的</w:t>
       </w:r>
+      <w:proofErr w:type="spellStart"/>
       <w:r>
         <w:rPr>
           <w:rFonts w:hint="eastAsia"/>
@@ -6483,6 +6819,7 @@
         </w:rPr>
         <w:t>client_sock</w:t>
       </w:r>
+      <w:proofErr w:type="spellEnd"/>
       <w:r>
         <w:rPr>
           <w:rFonts w:hint="eastAsia"/>
@@ -6552,6 +6889,7 @@
         </w:rPr>
         <w:t>将</w:t>
       </w:r>
+      <w:proofErr w:type="spellStart"/>
       <w:r>
         <w:rPr>
           <w:rFonts w:hint="eastAsia"/>
@@ -6560,6 +6898,7 @@
         </w:rPr>
         <w:t>client_sock</w:t>
       </w:r>
+      <w:proofErr w:type="spellEnd"/>
       <w:r>
         <w:rPr>
           <w:rFonts w:hint="eastAsia"/>
@@ -6574,8 +6913,18 @@
           <w:sz w:val="24"/>
           <w:szCs w:val="24"/>
         </w:rPr>
-        <w:t>&amp;client_sock</w:t>
-      </w:r>
+        <w:t>&amp;</w:t>
+      </w:r>
+      <w:proofErr w:type="spellStart"/>
+      <w:r>
+        <w:rPr>
+          <w:rFonts w:hint="eastAsia"/>
+          <w:sz w:val="24"/>
+          <w:szCs w:val="24"/>
+        </w:rPr>
+        <w:t>client_sock</w:t>
+      </w:r>
+      <w:proofErr w:type="spellEnd"/>
       <w:r>
         <w:rPr>
           <w:rFonts w:hint="eastAsia"/>
@@ -6646,13 +6995,97 @@
         </w:rPr>
         <w:tab/>
       </w:r>
+      <w:proofErr w:type="spellStart"/>
       <w:r>
         <w:rPr>
           <w:rFonts w:ascii="Consolas" w:hAnsi="Consolas"/>
           <w:sz w:val="18"/>
           <w:szCs w:val="18"/>
         </w:rPr>
-        <w:t>thpool_add_work(thpool, accept_request, (void*)&amp;client_sock);</w:t>
+        <w:t>thpool_add_</w:t>
+      </w:r>
+      <w:proofErr w:type="gramStart"/>
+      <w:r>
+        <w:rPr>
+          <w:rFonts w:ascii="Consolas" w:hAnsi="Consolas"/>
+          <w:sz w:val="18"/>
+          <w:szCs w:val="18"/>
+        </w:rPr>
+        <w:t>work</w:t>
+      </w:r>
+      <w:proofErr w:type="spellEnd"/>
+      <w:r>
+        <w:rPr>
+          <w:rFonts w:ascii="Consolas" w:hAnsi="Consolas"/>
+          <w:sz w:val="18"/>
+          <w:szCs w:val="18"/>
+        </w:rPr>
+        <w:t>(</w:t>
+      </w:r>
+      <w:proofErr w:type="spellStart"/>
+      <w:proofErr w:type="gramEnd"/>
+      <w:r>
+        <w:rPr>
+          <w:rFonts w:ascii="Consolas" w:hAnsi="Consolas"/>
+          <w:sz w:val="18"/>
+          <w:szCs w:val="18"/>
+        </w:rPr>
+        <w:t>thpool</w:t>
+      </w:r>
+      <w:proofErr w:type="spellEnd"/>
+      <w:r>
+        <w:rPr>
+          <w:rFonts w:ascii="Consolas" w:hAnsi="Consolas"/>
+          <w:sz w:val="18"/>
+          <w:szCs w:val="18"/>
+        </w:rPr>
+        <w:t xml:space="preserve">, </w:t>
+      </w:r>
+      <w:proofErr w:type="spellStart"/>
+      <w:r>
+        <w:rPr>
+          <w:rFonts w:ascii="Consolas" w:hAnsi="Consolas"/>
+          <w:sz w:val="18"/>
+          <w:szCs w:val="18"/>
+        </w:rPr>
+        <w:t>accept_request</w:t>
+      </w:r>
+      <w:proofErr w:type="spellEnd"/>
+      <w:r>
+        <w:rPr>
+          <w:rFonts w:ascii="Consolas" w:hAnsi="Consolas"/>
+          <w:sz w:val="18"/>
+          <w:szCs w:val="18"/>
+        </w:rPr>
+        <w:t>, (void</w:t>
+      </w:r>
+      <w:proofErr w:type="gramStart"/>
+      <w:r>
+        <w:rPr>
+          <w:rFonts w:ascii="Consolas" w:hAnsi="Consolas"/>
+          <w:sz w:val="18"/>
+          <w:szCs w:val="18"/>
+        </w:rPr>
+        <w:t>*)&amp;</w:t>
+      </w:r>
+      <w:proofErr w:type="spellStart"/>
+      <w:proofErr w:type="gramEnd"/>
+      <w:r>
+        <w:rPr>
+          <w:rFonts w:ascii="Consolas" w:hAnsi="Consolas"/>
+          <w:sz w:val="18"/>
+          <w:szCs w:val="18"/>
+        </w:rPr>
+        <w:t>client_sock</w:t>
+      </w:r>
+      <w:proofErr w:type="spellEnd"/>
+      <w:r>
+        <w:rPr>
+          <w:rFonts w:ascii="Consolas" w:hAnsi="Consolas"/>
+          <w:sz w:val="18"/>
+          <w:szCs w:val="18"/>
+        </w:rPr>
+        <w:t>);</w:t>
       </w:r>
     </w:p>
     <w:p>
@@ -6727,6 +7160,7 @@
         </w:rPr>
         <w:t>会修改</w:t>
       </w:r>
+      <w:proofErr w:type="spellStart"/>
       <w:r>
         <w:rPr>
           <w:rFonts w:hint="eastAsia"/>
@@ -6735,6 +7169,7 @@
         </w:rPr>
         <w:t>client_sock</w:t>
       </w:r>
+      <w:proofErr w:type="spellEnd"/>
       <w:r>
         <w:rPr>
           <w:rFonts w:hint="eastAsia"/>
@@ -6759,6 +7194,7 @@
         </w:rPr>
         <w:t>第一个连接相关任务进入队列后，未被工作线程及时取出，工作线程读取该任务对应的</w:t>
       </w:r>
+      <w:proofErr w:type="spellStart"/>
       <w:r>
         <w:rPr>
           <w:rFonts w:hint="eastAsia"/>
@@ -6767,6 +7203,7 @@
         </w:rPr>
         <w:t>client_sock</w:t>
       </w:r>
+      <w:proofErr w:type="spellEnd"/>
       <w:r>
         <w:rPr>
           <w:rFonts w:hint="eastAsia"/>
@@ -6802,7 +7239,25 @@
           <w:sz w:val="24"/>
           <w:szCs w:val="24"/>
         </w:rPr>
-        <w:t>解决方案：改用值传递</w:t>
+        <w:t>解决方案：</w:t>
+      </w:r>
+      <w:proofErr w:type="gramStart"/>
+      <w:r>
+        <w:rPr>
+          <w:rFonts w:hint="eastAsia"/>
+          <w:sz w:val="24"/>
+          <w:szCs w:val="24"/>
+        </w:rPr>
+        <w:t>改用值</w:t>
+      </w:r>
+      <w:proofErr w:type="gramEnd"/>
+      <w:r>
+        <w:rPr>
+          <w:rFonts w:hint="eastAsia"/>
+          <w:sz w:val="24"/>
+          <w:szCs w:val="24"/>
+        </w:rPr>
+        <w:t>传递</w:t>
       </w:r>
       <w:r>
         <w:rPr>
@@ -6820,6 +7275,7 @@
         </w:rPr>
         <w:t>借助</w:t>
       </w:r>
+      <w:proofErr w:type="spellStart"/>
       <w:r>
         <w:rPr>
           <w:rFonts w:hint="eastAsia"/>
@@ -6828,6 +7284,7 @@
         </w:rPr>
         <w:t>intptr_t</w:t>
       </w:r>
+      <w:proofErr w:type="spellEnd"/>
       <w:r>
         <w:rPr>
           <w:rFonts w:hint="eastAsia"/>
@@ -6917,15 +7374,32 @@
           <w:sz w:val="28"/>
           <w:szCs w:val="28"/>
         </w:rPr>
-        <w:t>自驱</w:t>
-      </w:r>
-      <w:r>
-        <w:rPr>
-          <w:rFonts w:hint="eastAsia"/>
-          <w:sz w:val="28"/>
-          <w:szCs w:val="28"/>
-        </w:rPr>
-        <w:t>实践拓展</w:t>
+        <w:t>自</w:t>
+      </w:r>
+      <w:proofErr w:type="gramStart"/>
+      <w:r>
+        <w:rPr>
+          <w:sz w:val="28"/>
+          <w:szCs w:val="28"/>
+        </w:rPr>
+        <w:t>驱</w:t>
+      </w:r>
+      <w:r>
+        <w:rPr>
+          <w:rFonts w:hint="eastAsia"/>
+          <w:sz w:val="28"/>
+          <w:szCs w:val="28"/>
+        </w:rPr>
+        <w:t>实践</w:t>
+      </w:r>
+      <w:proofErr w:type="gramEnd"/>
+      <w:r>
+        <w:rPr>
+          <w:rFonts w:hint="eastAsia"/>
+          <w:sz w:val="28"/>
+          <w:szCs w:val="28"/>
+        </w:rPr>
+        <w:t>拓展</w:t>
       </w:r>
       <w:r>
         <w:rPr>
@@ -6941,6 +7415,7 @@
         </w:rPr>
         <w:t>完成</w:t>
       </w:r>
+      <w:proofErr w:type="spellStart"/>
       <w:r>
         <w:rPr>
           <w:sz w:val="28"/>
@@ -6948,12 +7423,22 @@
         </w:rPr>
         <w:t>Hexo</w:t>
       </w:r>
-      <w:r>
-        <w:rPr>
-          <w:sz w:val="28"/>
-          <w:szCs w:val="28"/>
-        </w:rPr>
-        <w:t>个人博客部署，排查底层问题</w:t>
+      <w:proofErr w:type="spellEnd"/>
+      <w:proofErr w:type="gramStart"/>
+      <w:r>
+        <w:rPr>
+          <w:sz w:val="28"/>
+          <w:szCs w:val="28"/>
+        </w:rPr>
+        <w:t>个人博客部署</w:t>
+      </w:r>
+      <w:proofErr w:type="gramEnd"/>
+      <w:r>
+        <w:rPr>
+          <w:sz w:val="28"/>
+          <w:szCs w:val="28"/>
+        </w:rPr>
+        <w:t>，排查底层问题</w:t>
       </w:r>
       <w:r>
         <w:rPr>
@@ -7084,6 +7569,7 @@
         </w:rPr>
         <w:t>依赖</w:t>
       </w:r>
+      <w:proofErr w:type="spellStart"/>
       <w:r>
         <w:rPr>
           <w:rFonts w:hint="eastAsia"/>
@@ -7092,13 +7578,32 @@
         </w:rPr>
         <w:t>Hexo</w:t>
       </w:r>
-      <w:r>
-        <w:rPr>
-          <w:rFonts w:hint="eastAsia"/>
-          <w:sz w:val="24"/>
-          <w:szCs w:val="24"/>
-        </w:rPr>
-        <w:t>框架搭建的个人博客完整移植到该服务器运行</w:t>
+      <w:proofErr w:type="spellEnd"/>
+      <w:r>
+        <w:rPr>
+          <w:rFonts w:hint="eastAsia"/>
+          <w:sz w:val="24"/>
+          <w:szCs w:val="24"/>
+        </w:rPr>
+        <w:t>框架搭建的</w:t>
+      </w:r>
+      <w:proofErr w:type="gramStart"/>
+      <w:r>
+        <w:rPr>
+          <w:rFonts w:hint="eastAsia"/>
+          <w:sz w:val="24"/>
+          <w:szCs w:val="24"/>
+        </w:rPr>
+        <w:t>个人博客完整</w:t>
+      </w:r>
+      <w:proofErr w:type="gramEnd"/>
+      <w:r>
+        <w:rPr>
+          <w:rFonts w:hint="eastAsia"/>
+          <w:sz w:val="24"/>
+          <w:szCs w:val="24"/>
+        </w:rPr>
+        <w:t>移植到该服务器运行</w:t>
       </w:r>
       <w:r>
         <w:rPr>
@@ -7132,6 +7637,7 @@
         </w:rPr>
         <w:t>原版</w:t>
       </w:r>
+      <w:proofErr w:type="spellStart"/>
       <w:r>
         <w:rPr>
           <w:rFonts w:hint="eastAsia"/>
@@ -7140,6 +7646,7 @@
         </w:rPr>
         <w:t>Tinyhttpd</w:t>
       </w:r>
+      <w:proofErr w:type="spellEnd"/>
       <w:r>
         <w:rPr>
           <w:rFonts w:hint="eastAsia"/>
@@ -7211,12 +7718,21 @@
         </w:rPr>
         <w:t>调用文本处理所用的</w:t>
       </w:r>
-      <w:r>
-        <w:rPr>
-          <w:sz w:val="24"/>
-          <w:szCs w:val="24"/>
-        </w:rPr>
-        <w:t>fgets()</w:t>
+      <w:proofErr w:type="spellStart"/>
+      <w:r>
+        <w:rPr>
+          <w:sz w:val="24"/>
+          <w:szCs w:val="24"/>
+        </w:rPr>
+        <w:t>fgets</w:t>
+      </w:r>
+      <w:proofErr w:type="spellEnd"/>
+      <w:r>
+        <w:rPr>
+          <w:sz w:val="24"/>
+          <w:szCs w:val="24"/>
+        </w:rPr>
+        <w:t>()</w:t>
       </w:r>
       <w:r>
         <w:rPr>
@@ -7225,12 +7741,21 @@
         </w:rPr>
         <w:t>和</w:t>
       </w:r>
-      <w:r>
-        <w:rPr>
-          <w:sz w:val="24"/>
-          <w:szCs w:val="24"/>
-        </w:rPr>
-        <w:t>strlen()</w:t>
+      <w:proofErr w:type="spellStart"/>
+      <w:r>
+        <w:rPr>
+          <w:sz w:val="24"/>
+          <w:szCs w:val="24"/>
+        </w:rPr>
+        <w:t>strlen</w:t>
+      </w:r>
+      <w:proofErr w:type="spellEnd"/>
+      <w:r>
+        <w:rPr>
+          <w:sz w:val="24"/>
+          <w:szCs w:val="24"/>
+        </w:rPr>
+        <w:t>()</w:t>
       </w:r>
       <w:r>
         <w:rPr>
@@ -7312,12 +7837,21 @@
         </w:rPr>
         <w:t>函数，更换为底层</w:t>
       </w:r>
-      <w:r>
-        <w:rPr>
-          <w:sz w:val="24"/>
-          <w:szCs w:val="24"/>
-        </w:rPr>
-        <w:t>fread()</w:t>
+      <w:proofErr w:type="spellStart"/>
+      <w:r>
+        <w:rPr>
+          <w:sz w:val="24"/>
+          <w:szCs w:val="24"/>
+        </w:rPr>
+        <w:t>fread</w:t>
+      </w:r>
+      <w:proofErr w:type="spellEnd"/>
+      <w:r>
+        <w:rPr>
+          <w:sz w:val="24"/>
+          <w:szCs w:val="24"/>
+        </w:rPr>
+        <w:t>()</w:t>
       </w:r>
       <w:r>
         <w:rPr>
@@ -7334,6 +7868,7 @@
         </w:rPr>
         <w:t>的</w:t>
       </w:r>
+      <w:proofErr w:type="spellStart"/>
       <w:r>
         <w:rPr>
           <w:sz w:val="24"/>
@@ -7341,6 +7876,7 @@
         </w:rPr>
         <w:t>bytes_read</w:t>
       </w:r>
+      <w:proofErr w:type="spellEnd"/>
       <w:r>
         <w:rPr>
           <w:sz w:val="24"/>
@@ -7361,7 +7897,23 @@
           <w:sz w:val="24"/>
           <w:szCs w:val="24"/>
         </w:rPr>
-        <w:t>内容不受损。</w:t>
+        <w:t>内容</w:t>
+      </w:r>
+      <w:proofErr w:type="gramStart"/>
+      <w:r>
+        <w:rPr>
+          <w:sz w:val="24"/>
+          <w:szCs w:val="24"/>
+        </w:rPr>
+        <w:t>不</w:t>
+      </w:r>
+      <w:proofErr w:type="gramEnd"/>
+      <w:r>
+        <w:rPr>
+          <w:sz w:val="24"/>
+          <w:szCs w:val="24"/>
+        </w:rPr>
+        <w:t>受损。</w:t>
       </w:r>
       <w:r>
         <w:rPr>
@@ -7382,8 +7934,17 @@
           <w:sz w:val="24"/>
           <w:szCs w:val="24"/>
         </w:rPr>
-        <w:t>.webp</w:t>
-      </w:r>
+        <w:t>.</w:t>
+      </w:r>
+      <w:proofErr w:type="spellStart"/>
+      <w:r>
+        <w:rPr>
+          <w:sz w:val="24"/>
+          <w:szCs w:val="24"/>
+        </w:rPr>
+        <w:t>webp</w:t>
+      </w:r>
+      <w:proofErr w:type="spellEnd"/>
       <w:r>
         <w:rPr>
           <w:sz w:val="24"/>
@@ -7396,8 +7957,17 @@
           <w:sz w:val="24"/>
           <w:szCs w:val="24"/>
         </w:rPr>
-        <w:t>.svg</w:t>
-      </w:r>
+        <w:t>.</w:t>
+      </w:r>
+      <w:proofErr w:type="spellStart"/>
+      <w:r>
+        <w:rPr>
+          <w:sz w:val="24"/>
+          <w:szCs w:val="24"/>
+        </w:rPr>
+        <w:t>svg</w:t>
+      </w:r>
+      <w:proofErr w:type="spellEnd"/>
       <w:r>
         <w:rPr>
           <w:sz w:val="24"/>
@@ -7410,8 +7980,17 @@
           <w:sz w:val="24"/>
           <w:szCs w:val="24"/>
         </w:rPr>
-        <w:t>.ico</w:t>
-      </w:r>
+        <w:t>.</w:t>
+      </w:r>
+      <w:proofErr w:type="spellStart"/>
+      <w:r>
+        <w:rPr>
+          <w:sz w:val="24"/>
+          <w:szCs w:val="24"/>
+        </w:rPr>
+        <w:t>ico</w:t>
+      </w:r>
+      <w:proofErr w:type="spellEnd"/>
       <w:r>
         <w:rPr>
           <w:sz w:val="24"/>
@@ -7431,7 +8010,23 @@
           <w:sz w:val="24"/>
           <w:szCs w:val="24"/>
         </w:rPr>
-        <w:t>支持，博客中的高清多媒体资源</w:t>
+        <w:t>支持，</w:t>
+      </w:r>
+      <w:proofErr w:type="gramStart"/>
+      <w:r>
+        <w:rPr>
+          <w:sz w:val="24"/>
+          <w:szCs w:val="24"/>
+        </w:rPr>
+        <w:t>博客中</w:t>
+      </w:r>
+      <w:proofErr w:type="gramEnd"/>
+      <w:r>
+        <w:rPr>
+          <w:sz w:val="24"/>
+          <w:szCs w:val="24"/>
+        </w:rPr>
+        <w:t>的高清多媒体资源</w:t>
       </w:r>
       <w:r>
         <w:rPr>
@@ -7597,6 +8192,7 @@
         </w:rPr>
         <w:t>查询相关资料后，在</w:t>
       </w:r>
+      <w:proofErr w:type="spellStart"/>
       <w:r>
         <w:rPr>
           <w:sz w:val="24"/>
@@ -7604,6 +8200,7 @@
         </w:rPr>
         <w:t>accept_request</w:t>
       </w:r>
+      <w:proofErr w:type="spellEnd"/>
       <w:r>
         <w:rPr>
           <w:sz w:val="24"/>
@@ -7611,13 +8208,16 @@
         </w:rPr>
         <w:t>中编写</w:t>
       </w:r>
-      <w:r>
-        <w:rPr>
-          <w:sz w:val="24"/>
-          <w:szCs w:val="24"/>
-        </w:rPr>
+      <w:proofErr w:type="spellStart"/>
+      <w:r>
+        <w:rPr>
+          <w:sz w:val="24"/>
+          <w:szCs w:val="24"/>
+        </w:rPr>
+        <w:lastRenderedPageBreak/>
         <w:t>urldecode</w:t>
       </w:r>
+      <w:proofErr w:type="spellEnd"/>
       <w:r>
         <w:rPr>
           <w:rFonts w:hint="eastAsia"/>
@@ -7646,7 +8246,23 @@
           <w:sz w:val="24"/>
           <w:szCs w:val="24"/>
         </w:rPr>
-        <w:t>，对请求行做逆向还原，可让这台极简服务器运行包</w:t>
+        <w:t>，对请求行做逆向还原，可让这台</w:t>
+      </w:r>
+      <w:proofErr w:type="gramStart"/>
+      <w:r>
+        <w:rPr>
+          <w:sz w:val="24"/>
+          <w:szCs w:val="24"/>
+        </w:rPr>
+        <w:t>极</w:t>
+      </w:r>
+      <w:proofErr w:type="gramEnd"/>
+      <w:r>
+        <w:rPr>
+          <w:sz w:val="24"/>
+          <w:szCs w:val="24"/>
+        </w:rPr>
+        <w:t>简服务器运行包</w:t>
       </w:r>
       <w:r>
         <w:rPr>
@@ -7673,7 +8289,6 @@
         <w:rPr>
           <w:noProof/>
         </w:rPr>
-        <w:lastRenderedPageBreak/>
         <w:drawing>
           <wp:inline distT="0" distB="0" distL="0" distR="0" wp14:anchorId="0F9D78AA" wp14:editId="5A1266B0">
             <wp:extent cx="5273392" cy="2713939"/>
@@ -7981,6 +8596,7 @@
         </w:rPr>
         <w:t>基于</w:t>
       </w:r>
+      <w:proofErr w:type="spellStart"/>
       <w:r>
         <w:rPr>
           <w:rFonts w:ascii="Times New Roman" w:eastAsia="宋体" w:hAnsi="Times New Roman" w:cs="Times New Roman"/>
@@ -7989,6 +8605,7 @@
         </w:rPr>
         <w:t>Tinyhttpd</w:t>
       </w:r>
+      <w:proofErr w:type="spellEnd"/>
       <w:r>
         <w:rPr>
           <w:rFonts w:ascii="Times New Roman" w:eastAsia="宋体" w:hAnsi="Times New Roman" w:cs="Times New Roman" w:hint="eastAsia"/>
@@ -8005,6 +8622,7 @@
         </w:rPr>
         <w:t>的</w:t>
       </w:r>
+      <w:proofErr w:type="spellStart"/>
       <w:r>
         <w:rPr>
           <w:rFonts w:ascii="Times New Roman" w:eastAsia="宋体" w:hAnsi="Times New Roman" w:cs="Times New Roman" w:hint="eastAsia"/>
@@ -8013,6 +8631,7 @@
         </w:rPr>
         <w:t>Hexo</w:t>
       </w:r>
+      <w:proofErr w:type="spellEnd"/>
       <w:r>
         <w:rPr>
           <w:rFonts w:ascii="Times New Roman" w:eastAsia="宋体" w:hAnsi="Times New Roman" w:cs="Times New Roman"/>
@@ -8089,8 +8708,9 @@
           <w:sz w:val="24"/>
           <w:szCs w:val="24"/>
         </w:rPr>
-        <w:t>本次寒假专业实践项目，是我们参与过的各类实践项目中，难度最高</w:t>
-      </w:r>
+        <w:t>本次寒假专业实践项目，是我们参与过的各</w:t>
+      </w:r>
+      <w:proofErr w:type="gramStart"/>
       <w:r>
         <w:rPr>
           <w:rFonts w:hint="eastAsia"/>
@@ -8098,6 +8718,25 @@
           <w:sz w:val="24"/>
           <w:szCs w:val="24"/>
         </w:rPr>
+        <w:t>类实践</w:t>
+      </w:r>
+      <w:proofErr w:type="gramEnd"/>
+      <w:r>
+        <w:rPr>
+          <w:rFonts w:hint="eastAsia"/>
+          <w:color w:val="000000"/>
+          <w:sz w:val="24"/>
+          <w:szCs w:val="24"/>
+        </w:rPr>
+        <w:t>项目中，难度最高</w:t>
+      </w:r>
+      <w:r>
+        <w:rPr>
+          <w:rFonts w:hint="eastAsia"/>
+          <w:color w:val="000000"/>
+          <w:sz w:val="24"/>
+          <w:szCs w:val="24"/>
+        </w:rPr>
         <w:t>，</w:t>
       </w:r>
       <w:r>
@@ -8127,6 +8766,7 @@
         </w:rPr>
         <w:t>刚开始接触</w:t>
       </w:r>
+      <w:proofErr w:type="spellStart"/>
       <w:r>
         <w:rPr>
           <w:rFonts w:hint="eastAsia"/>
@@ -8136,6 +8776,7 @@
         </w:rPr>
         <w:t>Tinyhttpd</w:t>
       </w:r>
+      <w:proofErr w:type="spellEnd"/>
       <w:r>
         <w:rPr>
           <w:rFonts w:hint="eastAsia"/>
@@ -8163,6 +8804,7 @@
         </w:rPr>
         <w:t>梳理</w:t>
       </w:r>
+      <w:proofErr w:type="spellStart"/>
       <w:r>
         <w:rPr>
           <w:rFonts w:hint="eastAsia"/>
@@ -8172,6 +8814,7 @@
         </w:rPr>
         <w:t>Makefile</w:t>
       </w:r>
+      <w:proofErr w:type="spellEnd"/>
       <w:r>
         <w:rPr>
           <w:rFonts w:hint="eastAsia"/>
@@ -8199,6 +8842,7 @@
         </w:rPr>
         <w:t>之后处理多线程共享</w:t>
       </w:r>
+      <w:proofErr w:type="spellStart"/>
       <w:r>
         <w:rPr>
           <w:rFonts w:hint="eastAsia"/>
@@ -8208,6 +8852,7 @@
         </w:rPr>
         <w:t>client_sock</w:t>
       </w:r>
+      <w:proofErr w:type="spellEnd"/>
       <w:r>
         <w:rPr>
           <w:rFonts w:hint="eastAsia"/>
@@ -8235,6 +8880,7 @@
         </w:rPr>
         <w:t>逐行排查，找到</w:t>
       </w:r>
+      <w:proofErr w:type="spellStart"/>
       <w:r>
         <w:rPr>
           <w:rFonts w:hint="eastAsia"/>
@@ -8244,6 +8890,7 @@
         </w:rPr>
         <w:t>sds.h</w:t>
       </w:r>
+      <w:proofErr w:type="spellEnd"/>
       <w:r>
         <w:rPr>
           <w:rFonts w:hint="eastAsia"/>
@@ -8269,6 +8916,7 @@
           <w:sz w:val="24"/>
           <w:szCs w:val="24"/>
         </w:rPr>
+        <w:lastRenderedPageBreak/>
         <w:t>_VAR</w:t>
       </w:r>
       <w:r>
@@ -8333,7 +8981,6 @@
           <w:sz w:val="24"/>
           <w:szCs w:val="24"/>
         </w:rPr>
-        <w:lastRenderedPageBreak/>
         <w:t xml:space="preserve">    </w:t>
       </w:r>
       <w:r>
@@ -8442,8 +9089,9 @@
           <w:sz w:val="24"/>
           <w:szCs w:val="24"/>
         </w:rPr>
-        <w:t>终端显示并发压测数据稳定突破</w:t>
-      </w:r>
+        <w:t>终端显示</w:t>
+      </w:r>
+      <w:proofErr w:type="gramStart"/>
       <w:r>
         <w:rPr>
           <w:rFonts w:hint="eastAsia"/>
@@ -8451,6 +9099,25 @@
           <w:sz w:val="24"/>
           <w:szCs w:val="24"/>
         </w:rPr>
+        <w:t>并发压测数据</w:t>
+      </w:r>
+      <w:proofErr w:type="gramEnd"/>
+      <w:r>
+        <w:rPr>
+          <w:rFonts w:hint="eastAsia"/>
+          <w:color w:val="000000"/>
+          <w:sz w:val="24"/>
+          <w:szCs w:val="24"/>
+        </w:rPr>
+        <w:t>稳定突破</w:t>
+      </w:r>
+      <w:r>
+        <w:rPr>
+          <w:rFonts w:hint="eastAsia"/>
+          <w:color w:val="000000"/>
+          <w:sz w:val="24"/>
+          <w:szCs w:val="24"/>
+        </w:rPr>
         <w:t>1.3</w:t>
       </w:r>
       <w:r>
@@ -8489,6 +9156,7 @@
         </w:rPr>
         <w:t>自行修改底层</w:t>
       </w:r>
+      <w:proofErr w:type="spellStart"/>
       <w:r>
         <w:rPr>
           <w:rFonts w:hint="eastAsia"/>
@@ -8498,6 +9166,7 @@
         </w:rPr>
         <w:t>fread</w:t>
       </w:r>
+      <w:proofErr w:type="spellEnd"/>
       <w:r>
         <w:rPr>
           <w:rFonts w:hint="eastAsia"/>
@@ -8507,6 +9176,7 @@
         </w:rPr>
         <w:t>逻辑，修复图片损坏问题，让个人</w:t>
       </w:r>
+      <w:proofErr w:type="spellStart"/>
       <w:r>
         <w:rPr>
           <w:rFonts w:hint="eastAsia"/>
@@ -8516,6 +9186,8 @@
         </w:rPr>
         <w:t>Hexo</w:t>
       </w:r>
+      <w:proofErr w:type="spellEnd"/>
+      <w:proofErr w:type="gramStart"/>
       <w:r>
         <w:rPr>
           <w:rFonts w:hint="eastAsia"/>
@@ -8523,7 +9195,17 @@
           <w:sz w:val="24"/>
           <w:szCs w:val="24"/>
         </w:rPr>
-        <w:t>博客完整运行于这台服务器之上</w:t>
+        <w:t>博客完整</w:t>
+      </w:r>
+      <w:proofErr w:type="gramEnd"/>
+      <w:r>
+        <w:rPr>
+          <w:rFonts w:hint="eastAsia"/>
+          <w:color w:val="000000"/>
+          <w:sz w:val="24"/>
+          <w:szCs w:val="24"/>
+        </w:rPr>
+        <w:t>运行于这台服务器之上</w:t>
       </w:r>
       <w:r>
         <w:rPr>
@@ -8702,8 +9384,19 @@
           <w:sz w:val="24"/>
           <w:szCs w:val="24"/>
         </w:rPr>
-        <w:t>堪堪</w:t>
-      </w:r>
+        <w:t>堪</w:t>
+      </w:r>
+      <w:proofErr w:type="gramStart"/>
+      <w:r>
+        <w:rPr>
+          <w:rFonts w:hint="eastAsia"/>
+          <w:color w:val="000000"/>
+          <w:sz w:val="24"/>
+          <w:szCs w:val="24"/>
+        </w:rPr>
+        <w:t>堪</w:t>
+      </w:r>
+      <w:proofErr w:type="gramEnd"/>
       <w:r>
         <w:rPr>
           <w:rFonts w:hint="eastAsia"/>

</xml_diff>